<commit_message>
add response and kl logging for bedugging training collapse
</commit_message>
<xml_diff>
--- a/作业记录.docx
+++ b/作业记录.docx
@@ -88,13 +88,8 @@
         <w:t>sft_gpt-oss-120b_filtered.jsonl</w:t>
       </w:r>
       <w:r>
-        <w:t xml:space="preserve">/ </w:t>
-      </w:r>
-      <w:proofErr w:type="spellStart"/>
-      <w:r>
-        <w:t>math_results.jsonl</w:t>
-      </w:r>
-      <w:proofErr w:type="spellEnd"/>
+        <w:t>/ math_results.jsonl</w:t>
+      </w:r>
     </w:p>
     <w:p>
       <w:pPr>
@@ -125,7 +120,6 @@
           <w:rFonts w:hint="eastAsia"/>
         </w:rPr>
       </w:pPr>
-      <w:proofErr w:type="spellStart"/>
       <w:r>
         <w:rPr>
           <w:rFonts w:hint="eastAsia"/>
@@ -133,11 +127,7 @@
         <w:t>V</w:t>
       </w:r>
       <w:r>
-        <w:t>al.jsonl</w:t>
-      </w:r>
-      <w:proofErr w:type="spellEnd"/>
-      <w:r>
-        <w:t xml:space="preserve"> (validation data of assign5)</w:t>
+        <w:t>al.jsonl (validation data of assign5)</w:t>
       </w:r>
     </w:p>
     <w:p>
@@ -216,7 +206,6 @@
           <w:rFonts w:hint="eastAsia"/>
         </w:rPr>
       </w:pPr>
-      <w:proofErr w:type="spellStart"/>
       <w:r>
         <w:rPr>
           <w:rFonts w:hint="eastAsia"/>
@@ -224,19 +213,7 @@
         <w:t>P</w:t>
       </w:r>
       <w:r>
-        <w:t>olicy_loss</w:t>
-      </w:r>
-      <w:proofErr w:type="spellEnd"/>
-      <w:r>
-        <w:t xml:space="preserve"> (per </w:t>
-      </w:r>
-      <w:proofErr w:type="spellStart"/>
-      <w:r>
-        <w:t>micro_step</w:t>
-      </w:r>
-      <w:proofErr w:type="spellEnd"/>
-      <w:r>
-        <w:t>)</w:t>
+        <w:t>olicy_loss (per micro_step)</w:t>
       </w:r>
     </w:p>
     <w:p>
@@ -251,31 +228,7 @@
         </w:rPr>
       </w:pPr>
       <w:r>
-        <w:t xml:space="preserve">Reward accuracy (per </w:t>
-      </w:r>
-      <w:proofErr w:type="spellStart"/>
-      <w:r>
-        <w:t>n_eval_steps</w:t>
-      </w:r>
-      <w:proofErr w:type="spellEnd"/>
-      <w:r>
-        <w:t xml:space="preserve"> </w:t>
-      </w:r>
-      <w:proofErr w:type="spellStart"/>
-      <w:r>
-        <w:t>grpo</w:t>
-      </w:r>
-      <w:proofErr w:type="spellEnd"/>
-      <w:r>
-        <w:t xml:space="preserve"> train steps): train/ </w:t>
-      </w:r>
-      <w:proofErr w:type="spellStart"/>
-      <w:r>
-        <w:t>val</w:t>
-      </w:r>
-      <w:proofErr w:type="spellEnd"/>
-      <w:r>
-        <w:t xml:space="preserve"> rewards</w:t>
+        <w:t>Reward accuracy (per n_eval_steps grpo train steps): train/ val rewards</w:t>
       </w:r>
     </w:p>
     <w:p>
@@ -346,35 +299,7 @@
         <w:rPr>
           <w:rFonts w:hint="eastAsia"/>
         </w:rPr>
-        <w:t>Loss norm采用</w:t>
-      </w:r>
-      <w:proofErr w:type="spellStart"/>
-      <w:r>
-        <w:rPr>
-          <w:rFonts w:hint="eastAsia"/>
-        </w:rPr>
-        <w:t>masked_norm</w:t>
-      </w:r>
-      <w:proofErr w:type="spellEnd"/>
-      <w:r>
-        <w:rPr>
-          <w:rFonts w:hint="eastAsia"/>
-        </w:rPr>
-        <w:t>时（loss为</w:t>
-      </w:r>
-      <w:proofErr w:type="spellStart"/>
-      <w:r>
-        <w:rPr>
-          <w:rFonts w:hint="eastAsia"/>
-        </w:rPr>
-        <w:t>grpo</w:t>
-      </w:r>
-      <w:proofErr w:type="spellEnd"/>
-      <w:r>
-        <w:rPr>
-          <w:rFonts w:hint="eastAsia"/>
-        </w:rPr>
-        <w:t>-clip），训练在后期发生崩坏：</w:t>
+        <w:t>Loss norm采用masked_norm时（loss为grpo-clip），训练在后期发生崩坏：</w:t>
       </w:r>
     </w:p>
     <w:p>
@@ -567,19 +492,11 @@
         </w:rPr>
         <w:t>但是</w:t>
       </w:r>
-      <w:proofErr w:type="spellStart"/>
-      <w:r>
-        <w:rPr>
-          <w:rFonts w:hint="eastAsia"/>
-        </w:rPr>
-        <w:t>response_len_mean</w:t>
-      </w:r>
-      <w:proofErr w:type="spellEnd"/>
-      <w:r>
-        <w:rPr>
-          <w:rFonts w:hint="eastAsia"/>
-        </w:rPr>
-        <w:t>还在</w:t>
+      <w:r>
+        <w:rPr>
+          <w:rFonts w:hint="eastAsia"/>
+        </w:rPr>
+        <w:t>response_len_mean还在</w:t>
       </w:r>
       <w:r>
         <w:rPr>
@@ -670,25 +587,7 @@
           <w:bCs/>
         </w:rPr>
         <w:lastRenderedPageBreak/>
-        <w:t>问题应该出现在loss norm形式上，因为和只有采用不同loss norm（</w:t>
-      </w:r>
-      <w:proofErr w:type="spellStart"/>
-      <w:r>
-        <w:rPr>
-          <w:rFonts w:hint="eastAsia"/>
-          <w:b/>
-          <w:bCs/>
-        </w:rPr>
-        <w:t>masked_mean</w:t>
-      </w:r>
-      <w:proofErr w:type="spellEnd"/>
-      <w:r>
-        <w:rPr>
-          <w:rFonts w:hint="eastAsia"/>
-          <w:b/>
-          <w:bCs/>
-        </w:rPr>
-        <w:t>）的run作对比，另一个run整个训练过程都没有问题：</w:t>
+        <w:t>问题应该出现在loss norm形式上，因为和只有采用不同loss norm（masked_mean）的run作对比，另一个run整个训练过程都没有问题：</w:t>
       </w:r>
       <w:r>
         <w:rPr>
@@ -813,21 +712,7 @@
         <w:rPr>
           <w:rFonts w:hint="eastAsia"/>
         </w:rPr>
-        <w:t>（根本原因）sequence level的loss形式导致了长回答的grad更大，主导了模型update，并且由于advantage使用了</w:t>
-      </w:r>
-      <w:proofErr w:type="spellStart"/>
-      <w:r>
-        <w:rPr>
-          <w:rFonts w:hint="eastAsia"/>
-        </w:rPr>
-        <w:t>std_normalization</w:t>
-      </w:r>
-      <w:proofErr w:type="spellEnd"/>
-      <w:r>
-        <w:rPr>
-          <w:rFonts w:hint="eastAsia"/>
-        </w:rPr>
-        <w:t>，</w:t>
+        <w:t>（根本原因）sequence level的loss形式导致了长回答的grad更大，主导了模型update，并且由于advantage使用了std_normalization，</w:t>
       </w:r>
       <w:r>
         <w:rPr>
@@ -889,19 +774,11 @@
           <w:rFonts w:hint="eastAsia"/>
         </w:rPr>
       </w:pPr>
-      <w:proofErr w:type="spellStart"/>
-      <w:r>
-        <w:rPr>
-          <w:rFonts w:hint="eastAsia"/>
-        </w:rPr>
-        <w:t>Grpo_step</w:t>
-      </w:r>
-      <w:proofErr w:type="spellEnd"/>
-      <w:r>
-        <w:rPr>
-          <w:rFonts w:hint="eastAsia"/>
-        </w:rPr>
-        <w:t xml:space="preserve"> -&gt;</w:t>
+      <w:r>
+        <w:rPr>
+          <w:rFonts w:hint="eastAsia"/>
+        </w:rPr>
+        <w:t>Grpo_step -&gt;</w:t>
       </w:r>
     </w:p>
     <w:p>
@@ -933,14 +810,12 @@
           <w:rFonts w:hint="eastAsia"/>
         </w:rPr>
       </w:pPr>
-      <w:proofErr w:type="spellStart"/>
       <w:r>
         <w:rPr>
           <w:rFonts w:hint="eastAsia"/>
         </w:rPr>
         <w:t>Response_len</w:t>
       </w:r>
-      <w:proofErr w:type="spellEnd"/>
     </w:p>
     <w:p>
       <w:pPr>
@@ -985,6 +860,9 @@
           <w:ilvl w:val="0"/>
           <w:numId w:val="11"/>
         </w:numPr>
+        <w:rPr>
+          <w:rFonts w:hint="eastAsia"/>
+        </w:rPr>
       </w:pPr>
       <w:r>
         <w:rPr>
@@ -993,11 +871,18 @@
         <w:t>Loss/ grad (sum over sequence dimension)</w:t>
       </w:r>
     </w:p>
-    <w:p/>
+    <w:p>
+      <w:pPr>
+        <w:rPr>
+          <w:rFonts w:hint="eastAsia"/>
+        </w:rPr>
+      </w:pPr>
+    </w:p>
     <w:p>
       <w:pPr>
         <w:ind w:left="720"/>
         <w:rPr>
+          <w:rFonts w:hint="eastAsia"/>
           <w:u w:val="single"/>
         </w:rPr>
       </w:pPr>
@@ -1012,21 +897,16 @@
     <w:p>
       <w:pPr>
         <w:ind w:left="720"/>
-      </w:pPr>
-      <w:r>
-        <w:rPr>
-          <w:rFonts w:hint="eastAsia"/>
-        </w:rPr>
-        <w:t>文件格式：</w:t>
-      </w:r>
-      <w:proofErr w:type="spellStart"/>
-      <w:r>
-        <w:rPr>
-          <w:rFonts w:hint="eastAsia"/>
-        </w:rPr>
-        <w:t>jsonl</w:t>
-      </w:r>
-      <w:proofErr w:type="spellEnd"/>
+        <w:rPr>
+          <w:rFonts w:hint="eastAsia"/>
+        </w:rPr>
+      </w:pPr>
+      <w:r>
+        <w:rPr>
+          <w:rFonts w:hint="eastAsia"/>
+        </w:rPr>
+        <w:t>文件格式：jsonl</w:t>
+      </w:r>
     </w:p>
     <w:p>
       <w:pPr>
@@ -1039,13 +919,7 @@
         <w:rPr>
           <w:rFonts w:hint="eastAsia"/>
         </w:rPr>
-        <w:t>单个sample：</w:t>
-      </w:r>
-      <w:r>
-        <w:rPr>
-          <w:rFonts w:hint="eastAsia"/>
-        </w:rPr>
-        <w:t>{</w:t>
+        <w:t>单个sample：{</w:t>
       </w:r>
     </w:p>
     <w:p>
@@ -1059,27 +933,30 @@
         <w:rPr>
           <w:rFonts w:hint="eastAsia"/>
         </w:rPr>
-        <w:t xml:space="preserve">  "</w:t>
-      </w:r>
-      <w:proofErr w:type="spellStart"/>
-      <w:r>
-        <w:rPr>
-          <w:rFonts w:hint="eastAsia"/>
-        </w:rPr>
-        <w:t>grpo_</w:t>
-      </w:r>
-      <w:r>
-        <w:rPr>
-          <w:rFonts w:hint="eastAsia"/>
-        </w:rPr>
-        <w:t>step</w:t>
-      </w:r>
-      <w:proofErr w:type="spellEnd"/>
-      <w:r>
-        <w:rPr>
-          <w:rFonts w:hint="eastAsia"/>
-        </w:rPr>
-        <w:t>": 12,</w:t>
+        <w:t xml:space="preserve">  "grpo_step": 12,</w:t>
+      </w:r>
+    </w:p>
+    <w:p>
+      <w:pPr>
+        <w:ind w:left="720" w:firstLineChars="100" w:firstLine="210"/>
+        <w:rPr>
+          <w:rFonts w:hint="eastAsia"/>
+        </w:rPr>
+      </w:pPr>
+      <w:r>
+        <w:rPr>
+          <w:rFonts w:hint="eastAsia"/>
+        </w:rPr>
+        <w:t>"</w:t>
+      </w:r>
+      <w:r>
+        <w:t>sample</w:t>
+      </w:r>
+      <w:r>
+        <w:rPr>
+          <w:rFonts w:hint="eastAsia"/>
+        </w:rPr>
+        <w:t>_id": 87,</w:t>
       </w:r>
     </w:p>
     <w:p>
@@ -1090,30 +967,14 @@
         </w:rPr>
       </w:pPr>
       <w:r>
-        <w:rPr>
-          <w:rFonts w:hint="eastAsia"/>
-        </w:rPr>
-        <w:t xml:space="preserve">  "</w:t>
-      </w:r>
-      <w:proofErr w:type="spellStart"/>
-      <w:r>
-        <w:rPr>
-          <w:rFonts w:hint="eastAsia"/>
-        </w:rPr>
-        <w:t>response</w:t>
-      </w:r>
-      <w:r>
-        <w:rPr>
-          <w:rFonts w:hint="eastAsia"/>
-        </w:rPr>
-        <w:t>_id</w:t>
-      </w:r>
-      <w:proofErr w:type="spellEnd"/>
-      <w:r>
-        <w:rPr>
-          <w:rFonts w:hint="eastAsia"/>
-        </w:rPr>
-        <w:t>": 87,</w:t>
+        <w:tab/>
+        <w:t xml:space="preserve"> “</w:t>
+      </w:r>
+      <w:r>
+        <w:t>prompt</w:t>
+      </w:r>
+      <w:r>
+        <w:t>”: ,</w:t>
       </w:r>
     </w:p>
     <w:p>
@@ -1124,10 +985,7 @@
         </w:rPr>
       </w:pPr>
       <w:r>
-        <w:rPr>
-          <w:rFonts w:hint="eastAsia"/>
-        </w:rPr>
-        <w:t xml:space="preserve">  "response": "...",</w:t>
+        <w:t xml:space="preserve">  “response”: ,</w:t>
       </w:r>
     </w:p>
     <w:p>
@@ -1138,24 +996,24 @@
         </w:rPr>
       </w:pPr>
       <w:r>
-        <w:rPr>
-          <w:rFonts w:hint="eastAsia"/>
-        </w:rPr>
-        <w:t xml:space="preserve">  "</w:t>
-      </w:r>
-      <w:proofErr w:type="spellStart"/>
-      <w:r>
-        <w:rPr>
-          <w:rFonts w:hint="eastAsia"/>
-        </w:rPr>
-        <w:t>response_len</w:t>
-      </w:r>
-      <w:proofErr w:type="spellEnd"/>
-      <w:r>
-        <w:rPr>
-          <w:rFonts w:hint="eastAsia"/>
-        </w:rPr>
-        <w:t>": 128,</w:t>
+        <w:t xml:space="preserve">  </w:t>
+      </w:r>
+      <w:r>
+        <w:t>“answer”: ,</w:t>
+      </w:r>
+    </w:p>
+    <w:p>
+      <w:pPr>
+        <w:ind w:left="300" w:firstLine="420"/>
+        <w:rPr>
+          <w:rFonts w:hint="eastAsia"/>
+        </w:rPr>
+      </w:pPr>
+      <w:r>
+        <w:rPr>
+          <w:rFonts w:hint="eastAsia"/>
+        </w:rPr>
+        <w:t xml:space="preserve">  "response_len": 128,</w:t>
       </w:r>
     </w:p>
     <w:p>
@@ -1169,19 +1027,7 @@
         <w:rPr>
           <w:rFonts w:hint="eastAsia"/>
         </w:rPr>
-        <w:t xml:space="preserve">  "</w:t>
-      </w:r>
-      <w:r>
-        <w:rPr>
-          <w:rFonts w:hint="eastAsia"/>
-        </w:rPr>
-        <w:t>reward</w:t>
-      </w:r>
-      <w:r>
-        <w:rPr>
-          <w:rFonts w:hint="eastAsia"/>
-        </w:rPr>
-        <w:t>": 1.0,</w:t>
+        <w:t xml:space="preserve">  "reward": 1.0,</w:t>
       </w:r>
     </w:p>
     <w:p>
@@ -1203,25 +1049,48 @@
         <w:ind w:left="720"/>
         <w:rPr>
           <w:rFonts w:hint="eastAsia"/>
-        </w:rPr>
-      </w:pPr>
-      <w:r>
-        <w:rPr>
-          <w:rFonts w:hint="eastAsia"/>
-        </w:rPr>
-        <w:t xml:space="preserve">  "</w:t>
-      </w:r>
-      <w:r>
-        <w:rPr>
-          <w:rFonts w:hint="eastAsia"/>
-        </w:rPr>
-        <w:t>grad</w:t>
-      </w:r>
-      <w:r>
-        <w:rPr>
-          <w:rFonts w:hint="eastAsia"/>
-        </w:rPr>
-        <w:t>": 0.5</w:t>
+          <w:strike/>
+        </w:rPr>
+      </w:pPr>
+      <w:r>
+        <w:rPr>
+          <w:rFonts w:hint="eastAsia"/>
+        </w:rPr>
+        <w:t xml:space="preserve">  </w:t>
+      </w:r>
+      <w:r>
+        <w:rPr>
+          <w:rFonts w:hint="eastAsia"/>
+          <w:strike/>
+        </w:rPr>
+        <w:t>"grad"</w:t>
+      </w:r>
+      <w:r>
+        <w:rPr>
+          <w:strike/>
+        </w:rPr>
+        <w:t xml:space="preserve"> -&gt; </w:t>
+      </w:r>
+      <w:r>
+        <w:rPr>
+          <w:rFonts w:hint="eastAsia"/>
+          <w:strike/>
+        </w:rPr>
+        <w:t>1) 直接使用loss 2）直接使用已知项计算/估算grad</w:t>
+      </w:r>
+      <w:r>
+        <w:rPr>
+          <w:rFonts w:hint="eastAsia"/>
+          <w:strike/>
+        </w:rPr>
+        <w:t>：response_len, advantage</w:t>
+      </w:r>
+      <w:r>
+        <w:rPr>
+          <w:rFonts w:hint="eastAsia"/>
+          <w:strike/>
+        </w:rPr>
+        <w:t>，πθ可以不考虑入引起问题原因（i.e.不会造成梯度问题）3）计算grad，但是由于grad已使用batch loss计算，计算单个response的grad会造成额外计算。或者问gpt。</w:t>
       </w:r>
     </w:p>
     <w:p>
@@ -1267,19 +1136,11 @@
           <w:rFonts w:hint="eastAsia"/>
         </w:rPr>
       </w:pPr>
-      <w:proofErr w:type="spellStart"/>
-      <w:r>
-        <w:rPr>
-          <w:rFonts w:hint="eastAsia"/>
-        </w:rPr>
-        <w:t>Grpo_step</w:t>
-      </w:r>
-      <w:proofErr w:type="spellEnd"/>
-      <w:r>
-        <w:rPr>
-          <w:rFonts w:hint="eastAsia"/>
-        </w:rPr>
-        <w:t xml:space="preserve"> -&gt;</w:t>
+      <w:r>
+        <w:rPr>
+          <w:rFonts w:hint="eastAsia"/>
+        </w:rPr>
+        <w:t>Grpo_step -&gt;</w:t>
       </w:r>
     </w:p>
     <w:p>
@@ -1289,6 +1150,9 @@
           <w:ilvl w:val="0"/>
           <w:numId w:val="12"/>
         </w:numPr>
+        <w:rPr>
+          <w:rFonts w:hint="eastAsia"/>
+        </w:rPr>
       </w:pPr>
       <w:r>
         <w:rPr>
@@ -1296,20 +1160,25 @@
         </w:rPr>
         <w:t xml:space="preserve">KL(policy/ old policy) after each </w:t>
       </w:r>
-      <w:proofErr w:type="spellStart"/>
       <w:r>
         <w:rPr>
           <w:rFonts w:hint="eastAsia"/>
         </w:rPr>
         <w:t>update_step</w:t>
       </w:r>
-      <w:proofErr w:type="spellEnd"/>
-    </w:p>
-    <w:p/>
+    </w:p>
+    <w:p>
+      <w:pPr>
+        <w:rPr>
+          <w:rFonts w:hint="eastAsia"/>
+        </w:rPr>
+      </w:pPr>
+    </w:p>
     <w:p>
       <w:pPr>
         <w:ind w:left="720"/>
         <w:rPr>
+          <w:rFonts w:hint="eastAsia"/>
           <w:u w:val="single"/>
         </w:rPr>
       </w:pPr>
@@ -1331,6 +1200,9 @@
     <w:p>
       <w:pPr>
         <w:ind w:left="720"/>
+        <w:rPr>
+          <w:rFonts w:hint="eastAsia"/>
+        </w:rPr>
       </w:pPr>
       <w:r>
         <w:rPr>
@@ -1338,14 +1210,12 @@
         </w:rPr>
         <w:t>文件格式：</w:t>
       </w:r>
-      <w:proofErr w:type="spellStart"/>
       <w:r>
         <w:rPr>
           <w:rFonts w:hint="eastAsia"/>
         </w:rPr>
         <w:t>jsonl</w:t>
       </w:r>
-      <w:proofErr w:type="spellEnd"/>
     </w:p>
     <w:p>
       <w:pPr>
@@ -1358,33 +1228,7 @@
         <w:rPr>
           <w:rFonts w:hint="eastAsia"/>
         </w:rPr>
-        <w:t>数据格式：</w:t>
-      </w:r>
-      <w:proofErr w:type="spellStart"/>
-      <w:r>
-        <w:rPr>
-          <w:rFonts w:hint="eastAsia"/>
-        </w:rPr>
-        <w:t>grpo_step</w:t>
-      </w:r>
-      <w:proofErr w:type="spellEnd"/>
-      <w:r>
-        <w:rPr>
-          <w:rFonts w:hint="eastAsia"/>
-        </w:rPr>
-        <w:t xml:space="preserve"> -&gt; [</w:t>
-      </w:r>
-      <w:r>
-        <w:rPr>
-          <w:rFonts w:hint="eastAsia"/>
-        </w:rPr>
-        <w:t>KL(policy/ old policy)</w:t>
-      </w:r>
-      <w:r>
-        <w:rPr>
-          <w:rFonts w:hint="eastAsia"/>
-        </w:rPr>
-        <w:t xml:space="preserve"> after each update step]</w:t>
+        <w:t>数据格式：grpo_step -&gt; [KL(policy/ old policy) after each update step]</w:t>
       </w:r>
     </w:p>
     <w:p>
@@ -1424,14 +1268,12 @@
       <w:pPr>
         <w:pStyle w:val="a9"/>
         <w:ind w:left="360"/>
-        <w:rPr>
-          <w:rFonts w:hint="eastAsia"/>
-        </w:rPr>
-      </w:pPr>
-      <w:r>
-        <w:rPr>
-          <w:rFonts w:hint="eastAsia"/>
-        </w:rPr>
+      </w:pPr>
+      <w:r>
+        <w:rPr>
+          <w:rFonts w:hint="eastAsia"/>
+        </w:rPr>
+        <w:lastRenderedPageBreak/>
         <w:t xml:space="preserve">      是否有错误模型update现象：如果回答reward低，但advantage高，则会影响loss/grad准确性</w:t>
       </w:r>
       <w:r>
@@ -1451,6 +1293,54 @@
           <w:rFonts w:hint="eastAsia"/>
         </w:rPr>
         <w:t>则长回答会主导模型update。</w:t>
+      </w:r>
+    </w:p>
+    <w:p>
+      <w:pPr>
+        <w:pStyle w:val="a9"/>
+        <w:ind w:left="360"/>
+        <w:rPr>
+          <w:rFonts w:hint="eastAsia"/>
+        </w:rPr>
+      </w:pPr>
+      <w:r>
+        <w:tab/>
+      </w:r>
+      <w:r>
+        <w:tab/>
+      </w:r>
+      <w:r>
+        <w:rPr>
+          <w:rFonts w:hint="eastAsia"/>
+        </w:rPr>
+        <w:t xml:space="preserve">  观察response_len和reward相关性：理想状态response_len和reward应该相关性不强（或者按经验来说，response_len与reward应成稍微的正相关）</w:t>
+      </w:r>
+      <w:r>
+        <w:t>-&gt;</w:t>
+      </w:r>
+      <w:r>
+        <w:rPr>
+          <w:rFonts w:hint="eastAsia"/>
+        </w:rPr>
+        <w:t>（可以直接分析gpt-4o生成的ground truth CoT数据）</w:t>
+      </w:r>
+      <w:r>
+        <w:rPr>
+          <w:rFonts w:hint="eastAsia"/>
+        </w:rPr>
+        <w:t>，但是如果response_len和reward成一定的负相关，则可能是模型出现了length bias，即模型偏向生成长回答（</w:t>
+      </w:r>
+      <w:r>
+        <w:rPr>
+          <w:rFonts w:hint="eastAsia"/>
+        </w:rPr>
+        <w:t>长回答主导了模型update</w:t>
+      </w:r>
+      <w:r>
+        <w:rPr>
+          <w:rFonts w:hint="eastAsia"/>
+        </w:rPr>
+        <w:t>），但是长回答的准确率并不高。</w:t>
       </w:r>
     </w:p>
     <w:p>
@@ -1492,22 +1382,7 @@
         <w:rPr>
           <w:rFonts w:hint="eastAsia"/>
         </w:rPr>
-        <w:lastRenderedPageBreak/>
-        <w:t>散点图分析：做</w:t>
-      </w:r>
-      <w:proofErr w:type="spellStart"/>
-      <w:r>
-        <w:rPr>
-          <w:rFonts w:hint="eastAsia"/>
-        </w:rPr>
-        <w:t>response_len</w:t>
-      </w:r>
-      <w:proofErr w:type="spellEnd"/>
-      <w:r>
-        <w:rPr>
-          <w:rFonts w:hint="eastAsia"/>
-        </w:rPr>
-        <w:t>相对reward, advantage, grad散点图</w:t>
+        <w:t>散点图分析：做response_len相对reward, advantage, grad散点图</w:t>
       </w:r>
     </w:p>
     <w:p>
@@ -1525,21 +1400,7 @@
         <w:rPr>
           <w:rFonts w:hint="eastAsia"/>
         </w:rPr>
-        <w:t>Bucket分析：将</w:t>
-      </w:r>
-      <w:proofErr w:type="spellStart"/>
-      <w:r>
-        <w:rPr>
-          <w:rFonts w:hint="eastAsia"/>
-        </w:rPr>
-        <w:t>response_len</w:t>
-      </w:r>
-      <w:proofErr w:type="spellEnd"/>
-      <w:r>
-        <w:rPr>
-          <w:rFonts w:hint="eastAsia"/>
-        </w:rPr>
-        <w:t>分bucket，即不同大小区间，查看不同bucket的reward, advantage, grad分布。</w:t>
+        <w:t>Bucket分析：将response_len分bucket，即不同大小区间，查看不同bucket的reward, advantage, grad分布。</w:t>
       </w:r>
     </w:p>
     <w:p>
@@ -1601,23 +1462,7 @@
           <w:rFonts w:hint="eastAsia"/>
           <w:color w:val="00B0F0"/>
         </w:rPr>
-        <w:t>优化可能重复的</w:t>
-      </w:r>
-      <w:proofErr w:type="spellStart"/>
-      <w:r>
-        <w:rPr>
-          <w:rFonts w:hint="eastAsia"/>
-          <w:color w:val="00B0F0"/>
-        </w:rPr>
-        <w:t>gpu</w:t>
-      </w:r>
-      <w:proofErr w:type="spellEnd"/>
-      <w:r>
-        <w:rPr>
-          <w:rFonts w:hint="eastAsia"/>
-          <w:color w:val="00B0F0"/>
-        </w:rPr>
-        <w:t>占用：</w:t>
+        <w:t>优化可能重复的gpu占用：</w:t>
       </w:r>
     </w:p>
     <w:p>
@@ -1635,21 +1480,7 @@
         <w:rPr>
           <w:rFonts w:hint="eastAsia"/>
         </w:rPr>
-        <w:t xml:space="preserve">不需要grad的变量/ 操作使用with </w:t>
-      </w:r>
-      <w:proofErr w:type="spellStart"/>
-      <w:r>
-        <w:rPr>
-          <w:rFonts w:hint="eastAsia"/>
-        </w:rPr>
-        <w:t>torch.no_grad</w:t>
-      </w:r>
-      <w:proofErr w:type="spellEnd"/>
-      <w:r>
-        <w:rPr>
-          <w:rFonts w:hint="eastAsia"/>
-        </w:rPr>
-        <w:t>()：</w:t>
+        <w:t>不需要grad的变量/ 操作使用with torch.no_grad()：</w:t>
       </w:r>
     </w:p>
     <w:p>
@@ -1664,16 +1495,8 @@
         <w:rPr>
           <w:rFonts w:hint="eastAsia"/>
         </w:rPr>
-        <w:t xml:space="preserve">Computer token </w:t>
-      </w:r>
-      <w:proofErr w:type="spellStart"/>
-      <w:r>
-        <w:rPr>
-          <w:rFonts w:hint="eastAsia"/>
-        </w:rPr>
-        <w:t>entroypy</w:t>
-      </w:r>
-      <w:proofErr w:type="spellEnd"/>
+        <w:t>Computer token entroypy</w:t>
+      </w:r>
     </w:p>
     <w:p>
       <w:pPr>
@@ -1831,21 +1654,7 @@
         <w:rPr>
           <w:rFonts w:hint="eastAsia"/>
         </w:rPr>
-        <w:t>跑</w:t>
-      </w:r>
-      <w:proofErr w:type="spellStart"/>
-      <w:r>
-        <w:rPr>
-          <w:rFonts w:hint="eastAsia"/>
-        </w:rPr>
-        <w:t>Vllm</w:t>
-      </w:r>
-      <w:proofErr w:type="spellEnd"/>
-      <w:r>
-        <w:rPr>
-          <w:rFonts w:hint="eastAsia"/>
-        </w:rPr>
-        <w:t>不是并行的？</w:t>
+        <w:t>跑Vllm不是并行的？</w:t>
       </w:r>
     </w:p>
     <w:p>
@@ -1922,11 +1731,9 @@
         </w:rPr>
         <w:t>py里的</w:t>
       </w:r>
-      <w:proofErr w:type="spellStart"/>
       <w:r>
         <w:t>tokenize_prompt_and_output</w:t>
       </w:r>
-      <w:proofErr w:type="spellEnd"/>
       <w:r>
         <w:rPr>
           <w:rFonts w:hint="eastAsia"/>
@@ -1981,35 +1788,7 @@
         <w:rPr>
           <w:rFonts w:hint="eastAsia"/>
         </w:rPr>
-        <w:t>使用</w:t>
-      </w:r>
-      <w:proofErr w:type="spellStart"/>
-      <w:r>
-        <w:rPr>
-          <w:rFonts w:hint="eastAsia"/>
-        </w:rPr>
-        <w:t>sft</w:t>
-      </w:r>
-      <w:proofErr w:type="spellEnd"/>
-      <w:r>
-        <w:rPr>
-          <w:rFonts w:hint="eastAsia"/>
-        </w:rPr>
-        <w:t>-instruct的数据来</w:t>
-      </w:r>
-      <w:proofErr w:type="spellStart"/>
-      <w:r>
-        <w:rPr>
-          <w:rFonts w:hint="eastAsia"/>
-        </w:rPr>
-        <w:t>sft</w:t>
-      </w:r>
-      <w:proofErr w:type="spellEnd"/>
-      <w:r>
-        <w:rPr>
-          <w:rFonts w:hint="eastAsia"/>
-        </w:rPr>
-        <w:t>模型（可能可以从一个custom的model开始）</w:t>
+        <w:t>使用sft-instruct的数据来sft模型（可能可以从一个custom的model开始）</w:t>
       </w:r>
     </w:p>
     <w:p>
@@ -2065,21 +1844,7 @@
         <w:rPr>
           <w:rFonts w:hint="eastAsia"/>
         </w:rPr>
-        <w:t>修改</w:t>
-      </w:r>
-      <w:proofErr w:type="spellStart"/>
-      <w:r>
-        <w:rPr>
-          <w:rFonts w:hint="eastAsia"/>
-        </w:rPr>
-        <w:t>wandb</w:t>
-      </w:r>
-      <w:proofErr w:type="spellEnd"/>
-      <w:r>
-        <w:rPr>
-          <w:rFonts w:hint="eastAsia"/>
-        </w:rPr>
-        <w:t xml:space="preserve"> run name，把同一种类实验放到一个group</w:t>
+        <w:t>修改wandb run name，把同一种类实验放到一个group</w:t>
       </w:r>
       <w:r>
         <w:t xml:space="preserve"> project</w:t>
@@ -2120,16 +1885,8 @@
         <w:rPr>
           <w:rFonts w:hint="eastAsia"/>
         </w:rPr>
-        <w:t>修改</w:t>
-      </w:r>
-      <w:proofErr w:type="spellStart"/>
-      <w:r>
-        <w:rPr>
-          <w:rFonts w:hint="eastAsia"/>
-        </w:rPr>
-        <w:t>lr</w:t>
-      </w:r>
-      <w:proofErr w:type="spellEnd"/>
+        <w:t>修改lr</w:t>
+      </w:r>
       <w:r>
         <w:rPr>
           <w:rFonts w:hint="eastAsia"/>

</xml_diff>